<commit_message>
Placa sediu GAL v2: cod F36010804713061304413, finalizare 08.06.2028, Calibri
- placa.py: codul proiectului atribuit de AFIR (F36010804713061304413) și
  finalizarea la 08/06/2028 (21 de luni de la 08.09.2026); fișierul final e
  acum un PowerPoint de 70 x 50 cm cu modelul AFIR A.2 ca fundal vectorial și
  textele în Calibri, cum cere anexa; PDF-ul de tipar se exportă din Office.
  Carlito rămâne doar pentru calculul rândurilor și previzualizare.
- placa_pptx.js: generatorul PowerPoint (pptxgenjs).
- Fișa tehnică v2: ce s-a schimbat, pașii de export PDF cu Calibri încorporat,
  întrebările rămase (Proiectant/Executant, 70x50 sau 100x70, multifond).
- Analiza de comunicare (v1.1), CONTEXT, PLAN și README actualizate cu codul
  proiectului și data de finalizare.

Co-Authored-By: Claude Opus 5.5 <noreply@anthropic.com>
Claude-Session: https://claude.ai/code/session_01QhwJQVZkHYuMvyYV3aPwnV
</commit_message>
<xml_diff>
--- a/interventia5/Int5_Comunicare_si_vizibilitate_analiza.docx
+++ b/interventia5/Int5_Comunicare_si_vizibilitate_analiza.docx
@@ -21,7 +21,7 @@
           <w:color w:val="5A5A5A"/>
           <w:sz w:val="18"/>
         </w:rPr>
-        <w:t>Proiectul „Educație pentru mediu în teritoriul GAL Napoca Porolissum – micro-granturi pentru mediu”, contract de finanțare C 36010804713061304413 / 08.09.2026. Analiză de conformitate, partea 1 din analiza Ghidului solicitantului pentru Intervenția 5 „LEADER în verde”, sesiunea 2/2026. Versiunea 1, 02.10.2026.</w:t>
+        <w:t>Proiectul „Educație pentru mediu în teritoriul GAL Napoca Porolissum – micro-granturi pentru mediu”, contract de finanțare C 36010804713061304413 / 08.09.2026. Analiză de conformitate, partea 1 din analiza Ghidului solicitantului pentru Intervenția 5 „LEADER în verde”, sesiunea 2/2026. Versiunea 1, 02.10.2026; actualizată la 07.10.2026 cu codul proiectului și data de finalizare.</w:t>
       </w:r>
     </w:p>
     <w:tbl>
@@ -2660,7 +2660,7 @@
                 <w:i w:val="0"/>
                 <w:sz w:val="17"/>
               </w:rPr>
-              <w:t>C36010804713061304413</w:t>
+              <w:t>F36010804713061304413</w:t>
             </w:r>
           </w:p>
         </w:tc>
@@ -2679,7 +2679,7 @@
                 <w:i w:val="0"/>
                 <w:sz w:val="17"/>
               </w:rPr>
-              <w:t>Codul cererii de finanțare atribuit de AFIR. De confirmat că e același cu numărul contractului.</w:t>
+              <w:t>Codul cererii de finanțare atribuit de AFIR (confirmat de GAL, 07.10.2026). Diferă de numărul contractului, C 36010804713061304413.</w:t>
             </w:r>
           </w:p>
         </w:tc>
@@ -3145,7 +3145,7 @@
                 <w:i w:val="0"/>
                 <w:sz w:val="17"/>
               </w:rPr>
-              <w:t>07.06.2028 (estimat, 21 de luni)</w:t>
+              <w:t>08.06.2028</w:t>
             </w:r>
           </w:p>
         </w:tc>
@@ -3164,7 +3164,7 @@
                 <w:i w:val="0"/>
                 <w:sz w:val="17"/>
               </w:rPr>
-              <w:t>Se ia din contract.</w:t>
+              <w:t>Contractul dă doar durata, 21 de luni; termenul pe luni se împlinește în ziua corespunzătoare din ultima lună.</w:t>
             </w:r>
           </w:p>
         </w:tc>
@@ -3257,7 +3257,7 @@
           <w:sz w:val="20"/>
         </w:rPr>
         <w:br/>
-        <w:t>„Educație pentru mediu în teritoriul GAL Napoca Porolissum – micro-granturi pentru mediu” · Cod proiect C36010804713061304413 · Beneficiar: Asociația Grupul de Acțiune Locală Napoca Porolissum · Valoarea totală eligibilă: 138.643 euro, din care finanțare nerambursabilă PS 2023 – 2027: 138.643 euro · Perioada: 08.09.2026 – 07.06.2028.</w:t>
+        <w:t>„Educație pentru mediu în teritoriul GAL Napoca Porolissum – micro-granturi pentru mediu” · Cod proiect F36010804713061304413 · Beneficiar: Asociația Grupul de Acțiune Locală Napoca Porolissum · Valoarea totală eligibilă: 138.643 euro, din care finanțare nerambursabilă PS 2023 – 2027: 138.643 euro · Perioada: 08.09.2026 – 08.06.2028.</w:t>
         <w:br/>
         <w:t>Prin acest proiect, GAL Napoca Porolissum finanțează 6 inițiative de educație pentru mediu, de până la 19.833,3 euro fiecare, propuse de școli și ONG-uri din cele 14 localități ale teritoriului și selectate printr-un concurs deschis și transparent. Scopul este ca protecția mediului să devină o preocupare concretă a comunităților noastre, prin activități practice cu copiii, tinerii și cetățenii.</w:t>
         <w:br/>
@@ -5285,7 +5285,21 @@
           <w:b w:val="0"/>
           <w:i w:val="0"/>
         </w:rPr>
-        <w:t xml:space="preserve"> Codul proiectului de pe placă este același cu numărul contractului (C36010804713061304413)?</w:t>
+        <w:t xml:space="preserve"> </w:t>
+      </w:r>
+      <w:r>
+        <w:rPr>
+          <w:b/>
+          <w:i w:val="0"/>
+        </w:rPr>
+        <w:t>Lămurit la 07.10.2026:</w:t>
+      </w:r>
+      <w:r>
+        <w:rPr>
+          <w:b w:val="0"/>
+          <w:i w:val="0"/>
+        </w:rPr>
+        <w:t xml:space="preserve"> codul proiectului de pe placă este F36010804713061304413, nu numărul contractului.</w:t>
       </w:r>
     </w:p>
     <w:p>
@@ -6846,7 +6860,7 @@
         <w:color w:val="5A5A5A"/>
         <w:sz w:val="16"/>
       </w:rPr>
-      <w:t xml:space="preserve">Intervenția 5 – Comunicare și vizibilitate  ·  v1, 02.10.2026  ·  pagina </w:t>
+      <w:t xml:space="preserve">Intervenția 5 – Comunicare și vizibilitate  ·  v1.1, 07.10.2026  ·  pagina </w:t>
     </w:r>
     <w:r>
       <w:rPr>

</xml_diff>